<commit_message>
Fix Impeccable install heading; state Cloudflare confirm prompt
Impeccable is a plugin install, not a terminal install. The Cloudflare
skills CLI asks 'Proceed with installation?' in a normal terminal
(verified on Windows), so say so in the README and guide.

Co-Authored-By: Claude Sonnet 5.5 <noreply@anthropic.com>
</commit_message>
<xml_diff>
--- a/ClaudeCode-2026Setup-n-Skills.docx
+++ b/ClaudeCode-2026Setup-n-Skills.docx
@@ -3187,7 +3187,7 @@
         <w:spacing w:after="120"/>
       </w:pPr>
       <w:r>
-        <w:t xml:space="preserve">The Cloudflare step may ask you to confirm the install in the terminal. Answer the prompt to continue.</w:t>
+        <w:t xml:space="preserve">The Cloudflare step asks “Proceed with installation?” in the terminal. Answer Yes to continue.</w:t>
       </w:r>
     </w:p>
     <w:p>
@@ -4820,7 +4820,7 @@
           <w:bCs/>
           <w:color w:val="1F3864"/>
         </w:rPr>
-        <w:t xml:space="preserve">Install from the integrated terminal (PowerShell)</w:t>
+        <w:t>Install as a plugin (see “How to install a plugin”)</w:t>
       </w:r>
     </w:p>
     <w:tbl>

</xml_diff>